<commit_message>
Modification of the Main EEGpal layout
</commit_message>
<xml_diff>
--- a/Manuels/Manuel_EEGpal_Main.docx
+++ b/Manuels/Manuel_EEGpal_Main.docx
@@ -10,12 +10,76 @@
           <w:lang w:val="en-US"/>
         </w:rPr>
       </w:pPr>
-      <w:proofErr w:type="spellStart"/>
       <w:r>
         <w:rPr>
           <w:rFonts w:ascii="Calibri" w:hAnsi="Calibri" w:cs="Calibri"/>
           <w:b/>
           <w:bCs/>
+          <w:noProof/>
+          <w:lang w:val="en-US"/>
+        </w:rPr>
+        <w:drawing>
+          <wp:anchor distT="0" distB="0" distL="114300" distR="114300" simplePos="0" relativeHeight="251658240" behindDoc="0" locked="0" layoutInCell="1" allowOverlap="1" wp14:anchorId="0C8BE865" wp14:editId="24E822AA">
+            <wp:simplePos x="0" y="0"/>
+            <wp:positionH relativeFrom="margin">
+              <wp:align>right</wp:align>
+            </wp:positionH>
+            <wp:positionV relativeFrom="paragraph">
+              <wp:posOffset>-160209</wp:posOffset>
+            </wp:positionV>
+            <wp:extent cx="1145408" cy="937662"/>
+            <wp:effectExtent l="0" t="0" r="0" b="0"/>
+            <wp:wrapNone/>
+            <wp:docPr id="1162772292" name="Picture 1" descr="A blue brain with a heartbeat line&#10;&#10;AI-generated content may be incorrect."/>
+            <wp:cNvGraphicFramePr>
+              <a:graphicFrameLocks xmlns:a="http://schemas.openxmlformats.org/drawingml/2006/main" noChangeAspect="1"/>
+            </wp:cNvGraphicFramePr>
+            <a:graphic xmlns:a="http://schemas.openxmlformats.org/drawingml/2006/main">
+              <a:graphicData uri="http://schemas.openxmlformats.org/drawingml/2006/picture">
+                <pic:pic xmlns:pic="http://schemas.openxmlformats.org/drawingml/2006/picture">
+                  <pic:nvPicPr>
+                    <pic:cNvPr id="1162772292" name="Picture 1" descr="A blue brain with a heartbeat line&#10;&#10;AI-generated content may be incorrect."/>
+                    <pic:cNvPicPr/>
+                  </pic:nvPicPr>
+                  <pic:blipFill>
+                    <a:blip r:embed="rId7">
+                      <a:extLst>
+                        <a:ext uri="{28A0092B-C50C-407E-A947-70E740481C1C}">
+                          <a14:useLocalDpi xmlns:a14="http://schemas.microsoft.com/office/drawing/2010/main" val="0"/>
+                        </a:ext>
+                      </a:extLst>
+                    </a:blip>
+                    <a:stretch>
+                      <a:fillRect/>
+                    </a:stretch>
+                  </pic:blipFill>
+                  <pic:spPr>
+                    <a:xfrm>
+                      <a:off x="0" y="0"/>
+                      <a:ext cx="1145408" cy="937662"/>
+                    </a:xfrm>
+                    <a:prstGeom prst="rect">
+                      <a:avLst/>
+                    </a:prstGeom>
+                  </pic:spPr>
+                </pic:pic>
+              </a:graphicData>
+            </a:graphic>
+            <wp14:sizeRelH relativeFrom="margin">
+              <wp14:pctWidth>0</wp14:pctWidth>
+            </wp14:sizeRelH>
+            <wp14:sizeRelV relativeFrom="margin">
+              <wp14:pctHeight>0</wp14:pctHeight>
+            </wp14:sizeRelV>
+          </wp:anchor>
+        </w:drawing>
+      </w:r>
+      <w:proofErr w:type="spellStart"/>
+      <w:r>
+        <w:rPr>
+          <w:rFonts w:ascii="Calibri" w:hAnsi="Calibri" w:cs="Calibri"/>
+          <w:b/>
+          <w:bCs/>
           <w:lang w:val="en-US"/>
         </w:rPr>
         <w:t>EEGpal</w:t>
@@ -126,9 +190,25 @@
           <w:rFonts w:ascii="Calibri" w:hAnsi="Calibri" w:cs="Calibri"/>
           <w:lang w:val="en-US"/>
         </w:rPr>
-        <w:t xml:space="preserve">Video tutorial : </w:t>
-      </w:r>
-      <w:hyperlink r:id="rId7" w:history="1">
+        <w:t xml:space="preserve">Video </w:t>
+      </w:r>
+      <w:proofErr w:type="gramStart"/>
+      <w:r>
+        <w:rPr>
+          <w:rFonts w:ascii="Calibri" w:hAnsi="Calibri" w:cs="Calibri"/>
+          <w:lang w:val="en-US"/>
+        </w:rPr>
+        <w:t>tutorial :</w:t>
+      </w:r>
+      <w:proofErr w:type="gramEnd"/>
+      <w:r>
+        <w:rPr>
+          <w:rFonts w:ascii="Calibri" w:hAnsi="Calibri" w:cs="Calibri"/>
+          <w:lang w:val="en-US"/>
+        </w:rPr>
+        <w:t xml:space="preserve"> </w:t>
+      </w:r>
+      <w:hyperlink r:id="rId8" w:history="1">
         <w:r>
           <w:rPr>
             <w:rStyle w:val="Hyperlink"/>
@@ -186,7 +266,7 @@
         </w:rPr>
         <w:t xml:space="preserve">UNIL, </w:t>
       </w:r>
-      <w:hyperlink r:id="rId8" w:history="1">
+      <w:hyperlink r:id="rId9" w:history="1">
         <w:r>
           <w:rPr>
             <w:rStyle w:val="Hyperlink"/>
@@ -217,7 +297,7 @@
         </w:rPr>
         <w:t xml:space="preserve">and Michaël Mouthon (University of Fribourg, </w:t>
       </w:r>
-      <w:hyperlink r:id="rId9" w:history="1">
+      <w:hyperlink r:id="rId10" w:history="1">
         <w:r>
           <w:rPr>
             <w:rStyle w:val="Hyperlink"/>
@@ -257,7 +337,23 @@
           <w:rFonts w:ascii="Calibri" w:hAnsi="Calibri" w:cs="Calibri"/>
           <w:lang w:val="en-US"/>
         </w:rPr>
-        <w:t xml:space="preserve"> is an open-source </w:t>
+        <w:t xml:space="preserve"> is </w:t>
+      </w:r>
+      <w:proofErr w:type="gramStart"/>
+      <w:r>
+        <w:rPr>
+          <w:rFonts w:ascii="Calibri" w:hAnsi="Calibri" w:cs="Calibri"/>
+          <w:lang w:val="en-US"/>
+        </w:rPr>
+        <w:t>an open</w:t>
+      </w:r>
+      <w:proofErr w:type="gramEnd"/>
+      <w:r>
+        <w:rPr>
+          <w:rFonts w:ascii="Calibri" w:hAnsi="Calibri" w:cs="Calibri"/>
+          <w:lang w:val="en-US"/>
+        </w:rPr>
+        <w:t xml:space="preserve">-source </w:t>
       </w:r>
       <w:proofErr w:type="spellStart"/>
       <w:r>
@@ -349,9 +445,25 @@
           <w:rFonts w:ascii="Calibri" w:hAnsi="Calibri" w:cs="Calibri"/>
           <w:lang w:val="en-US"/>
         </w:rPr>
-        <w:t xml:space="preserve">, vol. 2011, 813870. DOI : </w:t>
-      </w:r>
-      <w:hyperlink r:id="rId10" w:tgtFrame="_blank" w:history="1">
+        <w:t xml:space="preserve">, vol. 2011, 813870. </w:t>
+      </w:r>
+      <w:proofErr w:type="gramStart"/>
+      <w:r>
+        <w:rPr>
+          <w:rFonts w:ascii="Calibri" w:hAnsi="Calibri" w:cs="Calibri"/>
+          <w:lang w:val="en-US"/>
+        </w:rPr>
+        <w:t>DOI :</w:t>
+      </w:r>
+      <w:proofErr w:type="gramEnd"/>
+      <w:r>
+        <w:rPr>
+          <w:rFonts w:ascii="Calibri" w:hAnsi="Calibri" w:cs="Calibri"/>
+          <w:lang w:val="en-US"/>
+        </w:rPr>
+        <w:t xml:space="preserve"> </w:t>
+      </w:r>
+      <w:hyperlink r:id="rId11" w:tgtFrame="_blank" w:history="1">
         <w:r>
           <w:rPr>
             <w:rStyle w:val="Hyperlink"/>
@@ -437,7 +549,7 @@
         </w:rPr>
         <w:t xml:space="preserve"> DOI: </w:t>
       </w:r>
-      <w:hyperlink r:id="rId11" w:tgtFrame="_blank" w:history="1">
+      <w:hyperlink r:id="rId12" w:tgtFrame="_blank" w:history="1">
         <w:r>
           <w:rPr>
             <w:rStyle w:val="Hyperlink"/>
@@ -780,6 +892,7 @@
         <w:t xml:space="preserve"> path (use of the command *</w:t>
       </w:r>
       <w:proofErr w:type="spellStart"/>
+      <w:proofErr w:type="gramStart"/>
       <w:r>
         <w:rPr>
           <w:lang w:val="en-US"/>
@@ -791,7 +904,14 @@
         <w:rPr>
           <w:lang w:val="en-US"/>
         </w:rPr>
-        <w:t xml:space="preserve">('path of the </w:t>
+        <w:t>(</w:t>
+      </w:r>
+      <w:proofErr w:type="gramEnd"/>
+      <w:r>
+        <w:rPr>
+          <w:lang w:val="en-US"/>
+        </w:rPr>
+        <w:t xml:space="preserve">'path of the </w:t>
       </w:r>
       <w:proofErr w:type="spellStart"/>
       <w:r>
@@ -805,7 +925,21 @@
         <w:rPr>
           <w:lang w:val="en-US"/>
         </w:rPr>
-        <w:t xml:space="preserve"> folder')*.</w:t>
+        <w:t xml:space="preserve"> folder</w:t>
+      </w:r>
+      <w:proofErr w:type="gramStart"/>
+      <w:r>
+        <w:rPr>
+          <w:lang w:val="en-US"/>
+        </w:rPr>
+        <w:t>')*</w:t>
+      </w:r>
+      <w:proofErr w:type="gramEnd"/>
+      <w:r>
+        <w:rPr>
+          <w:lang w:val="en-US"/>
+        </w:rPr>
+        <w:t>.</w:t>
       </w:r>
     </w:p>
     <w:p>
@@ -1125,8 +1259,17 @@
           <w:rFonts w:ascii="Calibri" w:hAnsi="Calibri" w:cs="Calibri"/>
           <w:lang w:val="en-US"/>
         </w:rPr>
-        <w:t>Before to start</w:t>
-      </w:r>
+        <w:t xml:space="preserve">Before </w:t>
+      </w:r>
+      <w:proofErr w:type="gramStart"/>
+      <w:r>
+        <w:rPr>
+          <w:rFonts w:ascii="Calibri" w:hAnsi="Calibri" w:cs="Calibri"/>
+          <w:lang w:val="en-US"/>
+        </w:rPr>
+        <w:t>to start</w:t>
+      </w:r>
+      <w:proofErr w:type="gramEnd"/>
     </w:p>
     <w:p>
       <w:pPr>
@@ -1155,14 +1298,62 @@
           <w:rFonts w:ascii="Calibri" w:hAnsi="Calibri" w:cs="Calibri"/>
           <w:lang w:val="en-US"/>
         </w:rPr>
-        <w:t xml:space="preserve"> the import ter</w:t>
-      </w:r>
-      <w:r>
-        <w:rPr>
-          <w:rFonts w:ascii="Calibri" w:hAnsi="Calibri" w:cs="Calibri"/>
-          <w:lang w:val="en-US"/>
-        </w:rPr>
-        <w:t>minology and concept to know before to use this toolbox.</w:t>
+        <w:t xml:space="preserve"> </w:t>
+      </w:r>
+      <w:proofErr w:type="gramStart"/>
+      <w:r>
+        <w:rPr>
+          <w:rFonts w:ascii="Calibri" w:hAnsi="Calibri" w:cs="Calibri"/>
+          <w:lang w:val="en-US"/>
+        </w:rPr>
+        <w:t>the</w:t>
+      </w:r>
+      <w:proofErr w:type="gramEnd"/>
+      <w:r>
+        <w:rPr>
+          <w:rFonts w:ascii="Calibri" w:hAnsi="Calibri" w:cs="Calibri"/>
+          <w:lang w:val="en-US"/>
+        </w:rPr>
+        <w:t xml:space="preserve"> import ter</w:t>
+      </w:r>
+      <w:r>
+        <w:rPr>
+          <w:rFonts w:ascii="Calibri" w:hAnsi="Calibri" w:cs="Calibri"/>
+          <w:lang w:val="en-US"/>
+        </w:rPr>
+        <w:t xml:space="preserve">minology and </w:t>
+      </w:r>
+      <w:proofErr w:type="gramStart"/>
+      <w:r>
+        <w:rPr>
+          <w:rFonts w:ascii="Calibri" w:hAnsi="Calibri" w:cs="Calibri"/>
+          <w:lang w:val="en-US"/>
+        </w:rPr>
+        <w:t>concept to know</w:t>
+      </w:r>
+      <w:proofErr w:type="gramEnd"/>
+      <w:r>
+        <w:rPr>
+          <w:rFonts w:ascii="Calibri" w:hAnsi="Calibri" w:cs="Calibri"/>
+          <w:lang w:val="en-US"/>
+        </w:rPr>
+        <w:t xml:space="preserve"> before </w:t>
+      </w:r>
+      <w:proofErr w:type="gramStart"/>
+      <w:r>
+        <w:rPr>
+          <w:rFonts w:ascii="Calibri" w:hAnsi="Calibri" w:cs="Calibri"/>
+          <w:lang w:val="en-US"/>
+        </w:rPr>
+        <w:t>to use</w:t>
+      </w:r>
+      <w:proofErr w:type="gramEnd"/>
+      <w:r>
+        <w:rPr>
+          <w:rFonts w:ascii="Calibri" w:hAnsi="Calibri" w:cs="Calibri"/>
+          <w:lang w:val="en-US"/>
+        </w:rPr>
+        <w:t xml:space="preserve"> this toolbox.</w:t>
       </w:r>
     </w:p>
     <w:p>
@@ -1300,6 +1491,7 @@
           <w:lang w:val="en-US"/>
         </w:rPr>
       </w:pPr>
+      <w:proofErr w:type="gramStart"/>
       <w:r>
         <w:rPr>
           <w:rFonts w:ascii="Calibri" w:hAnsi="Calibri" w:cs="Calibri"/>
@@ -1316,6 +1508,7 @@
         <w:t>bdf</w:t>
       </w:r>
       <w:proofErr w:type="spellEnd"/>
+      <w:proofErr w:type="gramEnd"/>
       <w:r>
         <w:rPr>
           <w:rFonts w:ascii="Calibri" w:hAnsi="Calibri" w:cs="Calibri"/>
@@ -1353,6 +1546,7 @@
           <w:lang w:val="en-US"/>
         </w:rPr>
       </w:pPr>
+      <w:proofErr w:type="gramStart"/>
       <w:r>
         <w:rPr>
           <w:rFonts w:ascii="Calibri" w:hAnsi="Calibri" w:cs="Calibri"/>
@@ -1369,6 +1563,7 @@
         <w:t>eph</w:t>
       </w:r>
       <w:proofErr w:type="spellEnd"/>
+      <w:proofErr w:type="gramEnd"/>
       <w:r>
         <w:rPr>
           <w:rFonts w:ascii="Calibri" w:hAnsi="Calibri" w:cs="Calibri"/>
@@ -1404,7 +1599,55 @@
           <w:rFonts w:ascii="Calibri" w:hAnsi="Calibri" w:cs="Calibri"/>
           <w:lang w:val="en-US"/>
         </w:rPr>
-        <w:t>. The first line is an header which contains info about the number of channel, number of time point and sampling rate</w:t>
+        <w:t xml:space="preserve">. The first line is </w:t>
+      </w:r>
+      <w:proofErr w:type="gramStart"/>
+      <w:r>
+        <w:rPr>
+          <w:rFonts w:ascii="Calibri" w:hAnsi="Calibri" w:cs="Calibri"/>
+          <w:lang w:val="en-US"/>
+        </w:rPr>
+        <w:t>an</w:t>
+      </w:r>
+      <w:proofErr w:type="gramEnd"/>
+      <w:r>
+        <w:rPr>
+          <w:rFonts w:ascii="Calibri" w:hAnsi="Calibri" w:cs="Calibri"/>
+          <w:lang w:val="en-US"/>
+        </w:rPr>
+        <w:t xml:space="preserve"> header which contains info about the number of </w:t>
+      </w:r>
+      <w:proofErr w:type="gramStart"/>
+      <w:r>
+        <w:rPr>
+          <w:rFonts w:ascii="Calibri" w:hAnsi="Calibri" w:cs="Calibri"/>
+          <w:lang w:val="en-US"/>
+        </w:rPr>
+        <w:t>channel</w:t>
+      </w:r>
+      <w:proofErr w:type="gramEnd"/>
+      <w:r>
+        <w:rPr>
+          <w:rFonts w:ascii="Calibri" w:hAnsi="Calibri" w:cs="Calibri"/>
+          <w:lang w:val="en-US"/>
+        </w:rPr>
+        <w:t xml:space="preserve">, number of time </w:t>
+      </w:r>
+      <w:proofErr w:type="gramStart"/>
+      <w:r>
+        <w:rPr>
+          <w:rFonts w:ascii="Calibri" w:hAnsi="Calibri" w:cs="Calibri"/>
+          <w:lang w:val="en-US"/>
+        </w:rPr>
+        <w:t>point</w:t>
+      </w:r>
+      <w:proofErr w:type="gramEnd"/>
+      <w:r>
+        <w:rPr>
+          <w:rFonts w:ascii="Calibri" w:hAnsi="Calibri" w:cs="Calibri"/>
+          <w:lang w:val="en-US"/>
+        </w:rPr>
+        <w:t xml:space="preserve"> and sampling rate</w:t>
       </w:r>
     </w:p>
     <w:p>
@@ -1420,12 +1663,21 @@
           <w:lang w:val="en-US"/>
         </w:rPr>
       </w:pPr>
-      <w:r>
-        <w:rPr>
-          <w:rFonts w:ascii="Calibri" w:hAnsi="Calibri" w:cs="Calibri"/>
-          <w:lang w:val="en-US"/>
-        </w:rPr>
-        <w:t xml:space="preserve">.ep:  Text file format </w:t>
+      <w:proofErr w:type="gramStart"/>
+      <w:r>
+        <w:rPr>
+          <w:rFonts w:ascii="Calibri" w:hAnsi="Calibri" w:cs="Calibri"/>
+          <w:lang w:val="en-US"/>
+        </w:rPr>
+        <w:t>.ep</w:t>
+      </w:r>
+      <w:proofErr w:type="gramEnd"/>
+      <w:r>
+        <w:rPr>
+          <w:rFonts w:ascii="Calibri" w:hAnsi="Calibri" w:cs="Calibri"/>
+          <w:lang w:val="en-US"/>
+        </w:rPr>
+        <w:t xml:space="preserve">:  Text file format </w:t>
       </w:r>
       <w:r>
         <w:rPr>
@@ -1515,6 +1767,7 @@
           <w:lang w:val="en-US"/>
         </w:rPr>
       </w:pPr>
+      <w:proofErr w:type="gramStart"/>
       <w:r>
         <w:rPr>
           <w:rFonts w:ascii="Calibri" w:hAnsi="Calibri" w:cs="Calibri"/>
@@ -1531,6 +1784,7 @@
         <w:t>sef</w:t>
       </w:r>
       <w:proofErr w:type="spellEnd"/>
+      <w:proofErr w:type="gramEnd"/>
       <w:r>
         <w:rPr>
           <w:rFonts w:ascii="Calibri" w:hAnsi="Calibri" w:cs="Calibri"/>
@@ -1591,6 +1845,7 @@
           <w:lang w:val="en-US"/>
         </w:rPr>
       </w:pPr>
+      <w:proofErr w:type="gramStart"/>
       <w:r>
         <w:rPr>
           <w:rFonts w:ascii="Calibri" w:hAnsi="Calibri" w:cs="Calibri"/>
@@ -1607,6 +1862,7 @@
         <w:t>fdt</w:t>
       </w:r>
       <w:proofErr w:type="spellEnd"/>
+      <w:proofErr w:type="gramEnd"/>
       <w:r>
         <w:rPr>
           <w:rFonts w:ascii="Calibri" w:hAnsi="Calibri" w:cs="Calibri"/>
@@ -1637,6 +1893,7 @@
           <w:lang w:val="en-US"/>
         </w:rPr>
       </w:pPr>
+      <w:proofErr w:type="gramStart"/>
       <w:r>
         <w:rPr>
           <w:rFonts w:ascii="Calibri" w:hAnsi="Calibri" w:cs="Calibri"/>
@@ -1653,6 +1910,7 @@
         <w:t>ris</w:t>
       </w:r>
       <w:proofErr w:type="spellEnd"/>
+      <w:proofErr w:type="gramEnd"/>
       <w:r>
         <w:rPr>
           <w:rFonts w:ascii="Calibri" w:hAnsi="Calibri" w:cs="Calibri"/>
@@ -1683,6 +1941,7 @@
           <w:lang w:val="en-US"/>
         </w:rPr>
       </w:pPr>
+      <w:proofErr w:type="gramStart"/>
       <w:r>
         <w:rPr>
           <w:rFonts w:ascii="Calibri" w:hAnsi="Calibri" w:cs="Calibri"/>
@@ -1700,6 +1959,7 @@
         <w:t>freq</w:t>
       </w:r>
       <w:proofErr w:type="spellEnd"/>
+      <w:proofErr w:type="gramEnd"/>
       <w:r>
         <w:rPr>
           <w:rFonts w:ascii="Calibri" w:hAnsi="Calibri" w:cs="Calibri"/>
@@ -1730,6 +1990,7 @@
           <w:lang w:val="en-US"/>
         </w:rPr>
       </w:pPr>
+      <w:proofErr w:type="gramStart"/>
       <w:r>
         <w:rPr>
           <w:rFonts w:ascii="Calibri" w:hAnsi="Calibri" w:cs="Calibri"/>
@@ -1746,12 +2007,29 @@
         <w:t>mrk</w:t>
       </w:r>
       <w:proofErr w:type="spellEnd"/>
-      <w:r>
-        <w:rPr>
-          <w:rFonts w:ascii="Calibri" w:hAnsi="Calibri" w:cs="Calibri"/>
-          <w:lang w:val="en-US"/>
-        </w:rPr>
-        <w:t xml:space="preserve">: marker file. It is a text file which include </w:t>
+      <w:proofErr w:type="gramEnd"/>
+      <w:r>
+        <w:rPr>
+          <w:rFonts w:ascii="Calibri" w:hAnsi="Calibri" w:cs="Calibri"/>
+          <w:lang w:val="en-US"/>
+        </w:rPr>
+        <w:t xml:space="preserve">: marker file. It is a text file which </w:t>
+      </w:r>
+      <w:proofErr w:type="gramStart"/>
+      <w:r>
+        <w:rPr>
+          <w:rFonts w:ascii="Calibri" w:hAnsi="Calibri" w:cs="Calibri"/>
+          <w:lang w:val="en-US"/>
+        </w:rPr>
+        <w:t>include</w:t>
+      </w:r>
+      <w:proofErr w:type="gramEnd"/>
+      <w:r>
+        <w:rPr>
+          <w:rFonts w:ascii="Calibri" w:hAnsi="Calibri" w:cs="Calibri"/>
+          <w:lang w:val="en-US"/>
+        </w:rPr>
+        <w:t xml:space="preserve"> </w:t>
       </w:r>
       <w:r>
         <w:rPr>
@@ -1774,6 +2052,7 @@
           <w:lang w:val="en-US"/>
         </w:rPr>
       </w:pPr>
+      <w:proofErr w:type="gramStart"/>
       <w:r>
         <w:rPr>
           <w:rFonts w:ascii="Calibri" w:hAnsi="Calibri" w:cs="Calibri"/>
@@ -1806,6 +2085,7 @@
         <w:t>vhdr</w:t>
       </w:r>
       <w:proofErr w:type="spellEnd"/>
+      <w:proofErr w:type="gramEnd"/>
       <w:r>
         <w:rPr>
           <w:rFonts w:ascii="Calibri" w:hAnsi="Calibri" w:cs="Calibri"/>
@@ -1827,7 +2107,15 @@
           <w:rFonts w:ascii="Calibri" w:hAnsi="Calibri" w:cs="Calibri"/>
           <w:lang w:val="en-US"/>
         </w:rPr>
-        <w:t xml:space="preserve"> recorder. This file format is automatically converted to .set/.</w:t>
+        <w:t xml:space="preserve"> recorder. This file format is automatically converted </w:t>
+      </w:r>
+      <w:proofErr w:type="gramStart"/>
+      <w:r>
+        <w:rPr>
+          <w:rFonts w:ascii="Calibri" w:hAnsi="Calibri" w:cs="Calibri"/>
+          <w:lang w:val="en-US"/>
+        </w:rPr>
+        <w:t>to .set/.</w:t>
       </w:r>
       <w:proofErr w:type="spellStart"/>
       <w:r>
@@ -1838,6 +2126,7 @@
         <w:t>fdt</w:t>
       </w:r>
       <w:proofErr w:type="spellEnd"/>
+      <w:proofErr w:type="gramEnd"/>
       <w:r>
         <w:rPr>
           <w:rFonts w:ascii="Calibri" w:hAnsi="Calibri" w:cs="Calibri"/>
@@ -1954,6 +2243,7 @@
         </w:rPr>
         <w:t xml:space="preserve">This tag could be a </w:t>
       </w:r>
+      <w:proofErr w:type="gramStart"/>
       <w:r>
         <w:rPr>
           <w:rFonts w:ascii="Calibri" w:hAnsi="Calibri" w:cs="Calibri"/>
@@ -1961,6 +2251,7 @@
         </w:rPr>
         <w:t>triggers</w:t>
       </w:r>
+      <w:proofErr w:type="gramEnd"/>
       <w:r>
         <w:rPr>
           <w:rFonts w:ascii="Calibri" w:hAnsi="Calibri" w:cs="Calibri"/>
@@ -1968,12 +2259,29 @@
         </w:rPr>
         <w:t xml:space="preserve"> or a </w:t>
       </w:r>
-      <w:r>
-        <w:rPr>
-          <w:rFonts w:ascii="Calibri" w:hAnsi="Calibri" w:cs="Calibri"/>
-          <w:lang w:val="en-US"/>
-        </w:rPr>
-        <w:t>markers. The difference is that the triggers are included in the EEG file (this is the case for .</w:t>
+      <w:proofErr w:type="gramStart"/>
+      <w:r>
+        <w:rPr>
+          <w:rFonts w:ascii="Calibri" w:hAnsi="Calibri" w:cs="Calibri"/>
+          <w:lang w:val="en-US"/>
+        </w:rPr>
+        <w:t>markers</w:t>
+      </w:r>
+      <w:proofErr w:type="gramEnd"/>
+      <w:r>
+        <w:rPr>
+          <w:rFonts w:ascii="Calibri" w:hAnsi="Calibri" w:cs="Calibri"/>
+          <w:lang w:val="en-US"/>
+        </w:rPr>
+        <w:t xml:space="preserve">. The difference is that the triggers are included in the EEG file (this is the case </w:t>
+      </w:r>
+      <w:proofErr w:type="gramStart"/>
+      <w:r>
+        <w:rPr>
+          <w:rFonts w:ascii="Calibri" w:hAnsi="Calibri" w:cs="Calibri"/>
+          <w:lang w:val="en-US"/>
+        </w:rPr>
+        <w:t>for .</w:t>
       </w:r>
       <w:proofErr w:type="spellStart"/>
       <w:r>
@@ -1984,6 +2292,7 @@
         <w:t>bdf</w:t>
       </w:r>
       <w:proofErr w:type="spellEnd"/>
+      <w:proofErr w:type="gramEnd"/>
       <w:r>
         <w:rPr>
           <w:rFonts w:ascii="Calibri" w:hAnsi="Calibri" w:cs="Calibri"/>
@@ -2005,7 +2314,15 @@
           <w:rFonts w:ascii="Calibri" w:hAnsi="Calibri" w:cs="Calibri"/>
           <w:lang w:val="en-US"/>
         </w:rPr>
-        <w:t xml:space="preserve"> (this is the case for .</w:t>
+        <w:t xml:space="preserve"> (this is the case </w:t>
+      </w:r>
+      <w:proofErr w:type="gramStart"/>
+      <w:r>
+        <w:rPr>
+          <w:rFonts w:ascii="Calibri" w:hAnsi="Calibri" w:cs="Calibri"/>
+          <w:lang w:val="en-US"/>
+        </w:rPr>
+        <w:t>for .</w:t>
       </w:r>
       <w:proofErr w:type="spellStart"/>
       <w:r>
@@ -2021,7 +2338,15 @@
           <w:rFonts w:ascii="Calibri" w:hAnsi="Calibri" w:cs="Calibri"/>
           <w:lang w:val="en-US"/>
         </w:rPr>
-        <w:t>, .ep, .</w:t>
+        <w:t>, .ep</w:t>
+      </w:r>
+      <w:proofErr w:type="gramEnd"/>
+      <w:r>
+        <w:rPr>
+          <w:rFonts w:ascii="Calibri" w:hAnsi="Calibri" w:cs="Calibri"/>
+          <w:lang w:val="en-US"/>
+        </w:rPr>
+        <w:t>, .</w:t>
       </w:r>
       <w:proofErr w:type="spellStart"/>
       <w:r>
@@ -2172,7 +2497,7 @@
                     <pic:cNvPicPr/>
                   </pic:nvPicPr>
                   <pic:blipFill>
-                    <a:blip r:embed="rId12"/>
+                    <a:blip r:embed="rId13"/>
                     <a:stretch>
                       <a:fillRect/>
                     </a:stretch>
@@ -2255,7 +2580,23 @@
           <w:rFonts w:ascii="Calibri" w:hAnsi="Calibri" w:cs="Calibri"/>
           <w:lang w:val="en-US"/>
         </w:rPr>
-        <w:t xml:space="preserve">Everyone has its own </w:t>
+        <w:t xml:space="preserve">Everyone has </w:t>
+      </w:r>
+      <w:proofErr w:type="gramStart"/>
+      <w:r>
+        <w:rPr>
+          <w:rFonts w:ascii="Calibri" w:hAnsi="Calibri" w:cs="Calibri"/>
+          <w:lang w:val="en-US"/>
+        </w:rPr>
+        <w:t>its</w:t>
+      </w:r>
+      <w:proofErr w:type="gramEnd"/>
+      <w:r>
+        <w:rPr>
+          <w:rFonts w:ascii="Calibri" w:hAnsi="Calibri" w:cs="Calibri"/>
+          <w:lang w:val="en-US"/>
+        </w:rPr>
+        <w:t xml:space="preserve"> own </w:t>
       </w:r>
       <w:r>
         <w:rPr>
@@ -2269,7 +2610,23 @@
           <w:rFonts w:ascii="Calibri" w:hAnsi="Calibri" w:cs="Calibri"/>
           <w:lang w:val="en-US"/>
         </w:rPr>
-        <w:t xml:space="preserve"> but the pipeline used by the Toolbox creator are detailed at the bottom of this document</w:t>
+        <w:t xml:space="preserve"> but the pipeline used by the Toolbox creator </w:t>
+      </w:r>
+      <w:proofErr w:type="gramStart"/>
+      <w:r>
+        <w:rPr>
+          <w:rFonts w:ascii="Calibri" w:hAnsi="Calibri" w:cs="Calibri"/>
+          <w:lang w:val="en-US"/>
+        </w:rPr>
+        <w:t>are</w:t>
+      </w:r>
+      <w:proofErr w:type="gramEnd"/>
+      <w:r>
+        <w:rPr>
+          <w:rFonts w:ascii="Calibri" w:hAnsi="Calibri" w:cs="Calibri"/>
+          <w:lang w:val="en-US"/>
+        </w:rPr>
+        <w:t xml:space="preserve"> detailed at the bottom of this document</w:t>
       </w:r>
       <w:r>
         <w:rPr>
@@ -2342,7 +2699,7 @@
                     <pic:cNvPicPr/>
                   </pic:nvPicPr>
                   <pic:blipFill>
-                    <a:blip r:embed="rId13"/>
+                    <a:blip r:embed="rId14"/>
                     <a:stretch>
                       <a:fillRect/>
                     </a:stretch>
@@ -2376,7 +2733,39 @@
           <w:rFonts w:ascii="Calibri" w:hAnsi="Calibri" w:cs="Calibri"/>
           <w:lang w:val="en-US"/>
         </w:rPr>
-        <w:t xml:space="preserve">There is five important section in the </w:t>
+        <w:t xml:space="preserve">There </w:t>
+      </w:r>
+      <w:proofErr w:type="gramStart"/>
+      <w:r>
+        <w:rPr>
+          <w:rFonts w:ascii="Calibri" w:hAnsi="Calibri" w:cs="Calibri"/>
+          <w:lang w:val="en-US"/>
+        </w:rPr>
+        <w:t>is</w:t>
+      </w:r>
+      <w:proofErr w:type="gramEnd"/>
+      <w:r>
+        <w:rPr>
+          <w:rFonts w:ascii="Calibri" w:hAnsi="Calibri" w:cs="Calibri"/>
+          <w:lang w:val="en-US"/>
+        </w:rPr>
+        <w:t xml:space="preserve"> five important </w:t>
+      </w:r>
+      <w:proofErr w:type="gramStart"/>
+      <w:r>
+        <w:rPr>
+          <w:rFonts w:ascii="Calibri" w:hAnsi="Calibri" w:cs="Calibri"/>
+          <w:lang w:val="en-US"/>
+        </w:rPr>
+        <w:t>section</w:t>
+      </w:r>
+      <w:proofErr w:type="gramEnd"/>
+      <w:r>
+        <w:rPr>
+          <w:rFonts w:ascii="Calibri" w:hAnsi="Calibri" w:cs="Calibri"/>
+          <w:lang w:val="en-US"/>
+        </w:rPr>
+        <w:t xml:space="preserve"> in the </w:t>
       </w:r>
       <w:proofErr w:type="spellStart"/>
       <w:r>
@@ -2646,7 +3035,23 @@
           <w:rFonts w:ascii="Calibri" w:hAnsi="Calibri" w:cs="Calibri"/>
           <w:lang w:val="en-US"/>
         </w:rPr>
-        <w:t>: Modules which permit various type of analysis on your preprocessed data</w:t>
+        <w:t xml:space="preserve">: Modules which permit various </w:t>
+      </w:r>
+      <w:proofErr w:type="gramStart"/>
+      <w:r>
+        <w:rPr>
+          <w:rFonts w:ascii="Calibri" w:hAnsi="Calibri" w:cs="Calibri"/>
+          <w:lang w:val="en-US"/>
+        </w:rPr>
+        <w:t>type</w:t>
+      </w:r>
+      <w:proofErr w:type="gramEnd"/>
+      <w:r>
+        <w:rPr>
+          <w:rFonts w:ascii="Calibri" w:hAnsi="Calibri" w:cs="Calibri"/>
+          <w:lang w:val="en-US"/>
+        </w:rPr>
+        <w:t xml:space="preserve"> of analysis on your preprocessed data</w:t>
       </w:r>
       <w:r>
         <w:rPr>
@@ -2749,7 +3154,7 @@
                     <pic:cNvPicPr/>
                   </pic:nvPicPr>
                   <pic:blipFill>
-                    <a:blip r:embed="rId14"/>
+                    <a:blip r:embed="rId15"/>
                     <a:stretch>
                       <a:fillRect/>
                     </a:stretch>
@@ -2790,8 +3195,19 @@
           <w:bCs/>
           <w:lang w:val="en-US"/>
         </w:rPr>
-        <w:t>File types</w:t>
-      </w:r>
+        <w:t xml:space="preserve">File </w:t>
+      </w:r>
+      <w:proofErr w:type="gramStart"/>
+      <w:r>
+        <w:rPr>
+          <w:rFonts w:ascii="Calibri" w:hAnsi="Calibri" w:cs="Calibri"/>
+          <w:b/>
+          <w:bCs/>
+          <w:lang w:val="en-US"/>
+        </w:rPr>
+        <w:t>types</w:t>
+      </w:r>
+      <w:proofErr w:type="gramEnd"/>
       <w:r>
         <w:rPr>
           <w:rFonts w:ascii="Calibri" w:hAnsi="Calibri" w:cs="Calibri"/>
@@ -3061,7 +3477,7 @@
                     <pic:cNvPicPr/>
                   </pic:nvPicPr>
                   <pic:blipFill>
-                    <a:blip r:embed="rId15"/>
+                    <a:blip r:embed="rId16"/>
                     <a:stretch>
                       <a:fillRect/>
                     </a:stretch>
@@ -3304,7 +3720,23 @@
           <w:rFonts w:ascii="Calibri" w:hAnsi="Calibri" w:cs="Calibri"/>
           <w:lang w:val="en-US"/>
         </w:rPr>
-        <w:t xml:space="preserve"> and Full Design +Statistics modules. These steps are indeed required to group all data from one subject. Otherwise, each file will be treated independently.</w:t>
+        <w:t xml:space="preserve"> and Full Design +Statistics modules. These steps are indeed required to </w:t>
+      </w:r>
+      <w:proofErr w:type="gramStart"/>
+      <w:r>
+        <w:rPr>
+          <w:rFonts w:ascii="Calibri" w:hAnsi="Calibri" w:cs="Calibri"/>
+          <w:lang w:val="en-US"/>
+        </w:rPr>
+        <w:t>group</w:t>
+      </w:r>
+      <w:proofErr w:type="gramEnd"/>
+      <w:r>
+        <w:rPr>
+          <w:rFonts w:ascii="Calibri" w:hAnsi="Calibri" w:cs="Calibri"/>
+          <w:lang w:val="en-US"/>
+        </w:rPr>
+        <w:t xml:space="preserve"> all data from one subject. Otherwise, each file will be treated independently.</w:t>
       </w:r>
     </w:p>
     <w:p>
@@ -3365,7 +3797,7 @@
                     <pic:cNvPicPr/>
                   </pic:nvPicPr>
                   <pic:blipFill>
-                    <a:blip r:embed="rId16"/>
+                    <a:blip r:embed="rId17"/>
                     <a:stretch>
                       <a:fillRect/>
                     </a:stretch>
@@ -3404,7 +3836,15 @@
           <w:rFonts w:ascii="Calibri" w:hAnsi="Calibri" w:cs="Calibri"/>
           <w:lang w:val="en-US"/>
         </w:rPr>
-        <w:t>Load the .</w:t>
+        <w:t xml:space="preserve">Load </w:t>
+      </w:r>
+      <w:proofErr w:type="gramStart"/>
+      <w:r>
+        <w:rPr>
+          <w:rFonts w:ascii="Calibri" w:hAnsi="Calibri" w:cs="Calibri"/>
+          <w:lang w:val="en-US"/>
+        </w:rPr>
+        <w:t>the .</w:t>
       </w:r>
       <w:proofErr w:type="spellStart"/>
       <w:r>
@@ -3431,6 +3871,7 @@
         <w:t>els</w:t>
       </w:r>
       <w:proofErr w:type="spellEnd"/>
+      <w:proofErr w:type="gramEnd"/>
       <w:r>
         <w:rPr>
           <w:rFonts w:ascii="Calibri" w:hAnsi="Calibri" w:cs="Calibri"/>
@@ -3897,7 +4338,7 @@
                     <pic:cNvPicPr/>
                   </pic:nvPicPr>
                   <pic:blipFill>
-                    <a:blip r:embed="rId17"/>
+                    <a:blip r:embed="rId18"/>
                     <a:stretch>
                       <a:fillRect/>
                     </a:stretch>
@@ -3936,7 +4377,15 @@
           <w:rFonts w:ascii="Calibri" w:hAnsi="Calibri" w:cs="Calibri"/>
           <w:lang w:val="en-US"/>
         </w:rPr>
-        <w:t>Select the output format (.</w:t>
+        <w:t xml:space="preserve">Select the output format </w:t>
+      </w:r>
+      <w:proofErr w:type="gramStart"/>
+      <w:r>
+        <w:rPr>
+          <w:rFonts w:ascii="Calibri" w:hAnsi="Calibri" w:cs="Calibri"/>
+          <w:lang w:val="en-US"/>
+        </w:rPr>
+        <w:t>(.</w:t>
       </w:r>
       <w:proofErr w:type="spellStart"/>
       <w:r>
@@ -3968,7 +4417,15 @@
           <w:rFonts w:ascii="Calibri" w:hAnsi="Calibri" w:cs="Calibri"/>
           <w:lang w:val="en-US"/>
         </w:rPr>
-        <w:t xml:space="preserve">, .ep for </w:t>
+        <w:t>, .ep</w:t>
+      </w:r>
+      <w:proofErr w:type="gramEnd"/>
+      <w:r>
+        <w:rPr>
+          <w:rFonts w:ascii="Calibri" w:hAnsi="Calibri" w:cs="Calibri"/>
+          <w:lang w:val="en-US"/>
+        </w:rPr>
+        <w:t xml:space="preserve"> for </w:t>
       </w:r>
       <w:proofErr w:type="spellStart"/>
       <w:r>
@@ -3984,7 +4441,23 @@
           <w:rFonts w:ascii="Calibri" w:hAnsi="Calibri" w:cs="Calibri"/>
           <w:lang w:val="en-US"/>
         </w:rPr>
-        <w:t xml:space="preserve"> or .set for </w:t>
+        <w:t xml:space="preserve"> </w:t>
+      </w:r>
+      <w:proofErr w:type="gramStart"/>
+      <w:r>
+        <w:rPr>
+          <w:rFonts w:ascii="Calibri" w:hAnsi="Calibri" w:cs="Calibri"/>
+          <w:lang w:val="en-US"/>
+        </w:rPr>
+        <w:t>or .set</w:t>
+      </w:r>
+      <w:proofErr w:type="gramEnd"/>
+      <w:r>
+        <w:rPr>
+          <w:rFonts w:ascii="Calibri" w:hAnsi="Calibri" w:cs="Calibri"/>
+          <w:lang w:val="en-US"/>
+        </w:rPr>
+        <w:t xml:space="preserve"> for </w:t>
       </w:r>
       <w:proofErr w:type="spellStart"/>
       <w:r>
@@ -4108,7 +4581,7 @@
                     <pic:cNvPicPr/>
                   </pic:nvPicPr>
                   <pic:blipFill>
-                    <a:blip r:embed="rId18"/>
+                    <a:blip r:embed="rId19"/>
                     <a:stretch>
                       <a:fillRect/>
                     </a:stretch>
@@ -4146,6 +4619,7 @@
         <w:t xml:space="preserve">The first preprocessing step is to detect any bridges (where two or more electrodes are connected due to gel leakage, resulting in them recording the same signal). It is </w:t>
       </w:r>
       <w:proofErr w:type="spellStart"/>
+      <w:proofErr w:type="gramStart"/>
       <w:r>
         <w:rPr>
           <w:rFonts w:ascii="Calibri" w:hAnsi="Calibri" w:cs="Calibri"/>
@@ -4154,12 +4628,29 @@
         <w:t>specially</w:t>
       </w:r>
       <w:proofErr w:type="spellEnd"/>
-      <w:r>
-        <w:rPr>
-          <w:rFonts w:ascii="Calibri" w:hAnsi="Calibri" w:cs="Calibri"/>
-          <w:lang w:val="en-US"/>
-        </w:rPr>
-        <w:t xml:space="preserve"> important to detect and remove these bridge if you perform ICA decomposition or Inverse solution analysis. </w:t>
+      <w:proofErr w:type="gramEnd"/>
+      <w:r>
+        <w:rPr>
+          <w:rFonts w:ascii="Calibri" w:hAnsi="Calibri" w:cs="Calibri"/>
+          <w:lang w:val="en-US"/>
+        </w:rPr>
+        <w:t xml:space="preserve"> important to detect and remove </w:t>
+      </w:r>
+      <w:proofErr w:type="gramStart"/>
+      <w:r>
+        <w:rPr>
+          <w:rFonts w:ascii="Calibri" w:hAnsi="Calibri" w:cs="Calibri"/>
+          <w:lang w:val="en-US"/>
+        </w:rPr>
+        <w:t>these bridge</w:t>
+      </w:r>
+      <w:proofErr w:type="gramEnd"/>
+      <w:r>
+        <w:rPr>
+          <w:rFonts w:ascii="Calibri" w:hAnsi="Calibri" w:cs="Calibri"/>
+          <w:lang w:val="en-US"/>
+        </w:rPr>
+        <w:t xml:space="preserve"> if you perform ICA decomposition or Inverse solution analysis. </w:t>
       </w:r>
     </w:p>
     <w:p>
@@ -4296,14 +4787,46 @@
           <w:rFonts w:ascii="Calibri" w:hAnsi="Calibri" w:cs="Calibri"/>
           <w:lang w:val="en-US"/>
         </w:rPr>
-        <w:t xml:space="preserve">The module will save a Excel sheet </w:t>
-      </w:r>
-      <w:r>
-        <w:rPr>
-          <w:rFonts w:ascii="Calibri" w:hAnsi="Calibri" w:cs="Calibri"/>
-          <w:lang w:val="en-US"/>
-        </w:rPr>
-        <w:t xml:space="preserve">(.xlsx) </w:t>
+        <w:t xml:space="preserve">The module will save </w:t>
+      </w:r>
+      <w:proofErr w:type="gramStart"/>
+      <w:r>
+        <w:rPr>
+          <w:rFonts w:ascii="Calibri" w:hAnsi="Calibri" w:cs="Calibri"/>
+          <w:lang w:val="en-US"/>
+        </w:rPr>
+        <w:t>a</w:t>
+      </w:r>
+      <w:proofErr w:type="gramEnd"/>
+      <w:r>
+        <w:rPr>
+          <w:rFonts w:ascii="Calibri" w:hAnsi="Calibri" w:cs="Calibri"/>
+          <w:lang w:val="en-US"/>
+        </w:rPr>
+        <w:t xml:space="preserve"> Excel </w:t>
+      </w:r>
+      <w:proofErr w:type="gramStart"/>
+      <w:r>
+        <w:rPr>
+          <w:rFonts w:ascii="Calibri" w:hAnsi="Calibri" w:cs="Calibri"/>
+          <w:lang w:val="en-US"/>
+        </w:rPr>
+        <w:t xml:space="preserve">sheet </w:t>
+      </w:r>
+      <w:r>
+        <w:rPr>
+          <w:rFonts w:ascii="Calibri" w:hAnsi="Calibri" w:cs="Calibri"/>
+          <w:lang w:val="en-US"/>
+        </w:rPr>
+        <w:t>(.</w:t>
+      </w:r>
+      <w:proofErr w:type="gramEnd"/>
+      <w:r>
+        <w:rPr>
+          <w:rFonts w:ascii="Calibri" w:hAnsi="Calibri" w:cs="Calibri"/>
+          <w:lang w:val="en-US"/>
+        </w:rPr>
+        <w:t xml:space="preserve">xlsx) </w:t>
       </w:r>
       <w:r>
         <w:rPr>
@@ -4398,7 +4921,7 @@
                     <pic:cNvPicPr/>
                   </pic:nvPicPr>
                   <pic:blipFill>
-                    <a:blip r:embed="rId19"/>
+                    <a:blip r:embed="rId20"/>
                     <a:stretch>
                       <a:fillRect/>
                     </a:stretch>
@@ -4516,7 +5039,7 @@
                     <pic:cNvPicPr/>
                   </pic:nvPicPr>
                   <pic:blipFill>
-                    <a:blip r:embed="rId20"/>
+                    <a:blip r:embed="rId21"/>
                     <a:stretch>
                       <a:fillRect/>
                     </a:stretch>
@@ -4565,7 +5088,23 @@
           <w:rFonts w:ascii="Calibri" w:hAnsi="Calibri" w:cs="Calibri"/>
           <w:lang w:val="en-US"/>
         </w:rPr>
-        <w:t xml:space="preserve"> functions. It stores all the parameters that you enter into the various processing and analysis modules. When you open a module and set the processing parameters (for example, adding a notch filter at 50 Hz in the Filtering+ module), clicking the </w:t>
+        <w:t xml:space="preserve"> functions. It stores all the parameters that you </w:t>
+      </w:r>
+      <w:proofErr w:type="gramStart"/>
+      <w:r>
+        <w:rPr>
+          <w:rFonts w:ascii="Calibri" w:hAnsi="Calibri" w:cs="Calibri"/>
+          <w:lang w:val="en-US"/>
+        </w:rPr>
+        <w:t>enter into</w:t>
+      </w:r>
+      <w:proofErr w:type="gramEnd"/>
+      <w:r>
+        <w:rPr>
+          <w:rFonts w:ascii="Calibri" w:hAnsi="Calibri" w:cs="Calibri"/>
+          <w:lang w:val="en-US"/>
+        </w:rPr>
+        <w:t xml:space="preserve"> the various processing and analysis modules. When you open a module and set the processing parameters (for example, adding a notch filter at 50 Hz in the Filtering+ module), clicking the </w:t>
       </w:r>
       <w:r>
         <w:rPr>
@@ -5110,7 +5649,23 @@
           <w:rFonts w:ascii="Calibri" w:hAnsi="Calibri" w:cs="Calibri"/>
           <w:lang w:val="en-US"/>
         </w:rPr>
-        <w:t xml:space="preserve">In this document, we distinguish the preprocessing, which permits to clean the data for the data analysis (the processing). The preprocessing is similar between the type of analysis but with some variation. Here I will first describe the case of Event Related Analysis (ERP). </w:t>
+        <w:t xml:space="preserve">In this document, we distinguish the preprocessing, which permits to clean the data for the data analysis (the processing). The preprocessing is similar between the </w:t>
+      </w:r>
+      <w:proofErr w:type="gramStart"/>
+      <w:r>
+        <w:rPr>
+          <w:rFonts w:ascii="Calibri" w:hAnsi="Calibri" w:cs="Calibri"/>
+          <w:lang w:val="en-US"/>
+        </w:rPr>
+        <w:t>type</w:t>
+      </w:r>
+      <w:proofErr w:type="gramEnd"/>
+      <w:r>
+        <w:rPr>
+          <w:rFonts w:ascii="Calibri" w:hAnsi="Calibri" w:cs="Calibri"/>
+          <w:lang w:val="en-US"/>
+        </w:rPr>
+        <w:t xml:space="preserve"> of analysis but with some variation. Here I will first describe the case of Event Related Analysis (ERP). </w:t>
       </w:r>
       <w:r>
         <w:rPr>
@@ -5296,7 +5851,23 @@
           <w:rFonts w:ascii="Calibri" w:hAnsi="Calibri" w:cs="Calibri"/>
           <w:lang w:val="en-US"/>
         </w:rPr>
-        <w:t xml:space="preserve"> in order to check if there is any unwanted connection between channels</w:t>
+        <w:t xml:space="preserve"> </w:t>
+      </w:r>
+      <w:proofErr w:type="gramStart"/>
+      <w:r>
+        <w:rPr>
+          <w:rFonts w:ascii="Calibri" w:hAnsi="Calibri" w:cs="Calibri"/>
+          <w:lang w:val="en-US"/>
+        </w:rPr>
+        <w:t>in order to</w:t>
+      </w:r>
+      <w:proofErr w:type="gramEnd"/>
+      <w:r>
+        <w:rPr>
+          <w:rFonts w:ascii="Calibri" w:hAnsi="Calibri" w:cs="Calibri"/>
+          <w:lang w:val="en-US"/>
+        </w:rPr>
+        <w:t xml:space="preserve"> check if there is any unwanted connection between channels</w:t>
       </w:r>
     </w:p>
     <w:p>
@@ -5332,7 +5903,23 @@
           <w:rFonts w:ascii="Calibri" w:hAnsi="Calibri" w:cs="Calibri"/>
           <w:lang w:val="en-US"/>
         </w:rPr>
-        <w:t xml:space="preserve"> for the first clean of the data. Filter to keep the signal between 0.</w:t>
+        <w:t xml:space="preserve"> for the first </w:t>
+      </w:r>
+      <w:proofErr w:type="gramStart"/>
+      <w:r>
+        <w:rPr>
+          <w:rFonts w:ascii="Calibri" w:hAnsi="Calibri" w:cs="Calibri"/>
+          <w:lang w:val="en-US"/>
+        </w:rPr>
+        <w:t>clean</w:t>
+      </w:r>
+      <w:proofErr w:type="gramEnd"/>
+      <w:r>
+        <w:rPr>
+          <w:rFonts w:ascii="Calibri" w:hAnsi="Calibri" w:cs="Calibri"/>
+          <w:lang w:val="en-US"/>
+        </w:rPr>
+        <w:t xml:space="preserve"> of the data. Filter to keep the signal between 0.</w:t>
       </w:r>
       <w:r>
         <w:rPr>
@@ -5346,7 +5933,23 @@
           <w:rFonts w:ascii="Calibri" w:hAnsi="Calibri" w:cs="Calibri"/>
           <w:lang w:val="en-US"/>
         </w:rPr>
-        <w:t xml:space="preserve"> and 40 Hz. Add a Line noise removal either by a Notch filter at 50 Hz or by using </w:t>
+        <w:t xml:space="preserve"> and 40 Hz. Add </w:t>
+      </w:r>
+      <w:proofErr w:type="gramStart"/>
+      <w:r>
+        <w:rPr>
+          <w:rFonts w:ascii="Calibri" w:hAnsi="Calibri" w:cs="Calibri"/>
+          <w:lang w:val="en-US"/>
+        </w:rPr>
+        <w:t>a Line</w:t>
+      </w:r>
+      <w:proofErr w:type="gramEnd"/>
+      <w:r>
+        <w:rPr>
+          <w:rFonts w:ascii="Calibri" w:hAnsi="Calibri" w:cs="Calibri"/>
+          <w:lang w:val="en-US"/>
+        </w:rPr>
+        <w:t xml:space="preserve"> noise removal either by a Notch filter at 50 Hz or by using </w:t>
       </w:r>
       <w:proofErr w:type="spellStart"/>
       <w:r>
@@ -5612,7 +6215,23 @@
           <w:rFonts w:ascii="Calibri" w:hAnsi="Calibri" w:cs="Calibri"/>
           <w:lang w:val="en-US"/>
         </w:rPr>
-        <w:t xml:space="preserve"> module to interpolated bad electrodes determined in 3,5 and 7.  </w:t>
+        <w:t xml:space="preserve"> module to </w:t>
+      </w:r>
+      <w:proofErr w:type="gramStart"/>
+      <w:r>
+        <w:rPr>
+          <w:rFonts w:ascii="Calibri" w:hAnsi="Calibri" w:cs="Calibri"/>
+          <w:lang w:val="en-US"/>
+        </w:rPr>
+        <w:t>interpolated</w:t>
+      </w:r>
+      <w:proofErr w:type="gramEnd"/>
+      <w:r>
+        <w:rPr>
+          <w:rFonts w:ascii="Calibri" w:hAnsi="Calibri" w:cs="Calibri"/>
+          <w:lang w:val="en-US"/>
+        </w:rPr>
+        <w:t xml:space="preserve"> bad electrodes determined in 3,5 and 7.  </w:t>
       </w:r>
     </w:p>
     <w:p>
@@ -5690,7 +6309,7 @@
       </w:r>
     </w:p>
     <w:sectPr>
-      <w:footerReference w:type="default" r:id="rId21"/>
+      <w:footerReference w:type="default" r:id="rId22"/>
       <w:pgSz w:w="11906" w:h="16838"/>
       <w:pgMar w:top="1417" w:right="1417" w:bottom="1417" w:left="1417" w:header="708" w:footer="708" w:gutter="0"/>
       <w:cols w:space="708"/>
@@ -7723,6 +8342,7 @@
   <w:style w:type="character" w:default="1" w:styleId="DefaultParagraphFont">
     <w:name w:val="Default Paragraph Font"/>
     <w:uiPriority w:val="1"/>
+    <w:semiHidden/>
     <w:unhideWhenUsed/>
   </w:style>
   <w:style w:type="table" w:default="1" w:styleId="TableNormal">

</xml_diff>